<commit_message>
OECD international comparisons: manual-only, correct links, drop disclaimer
- Correct the OECD data-explorer download links to use the Euro area entity
  EA (was EA20) for all three measures, so the Euro area row populates.
- Make OECD a manual upload like the other ONS sources: remove the automatic
  postgres auto-fetch on session start, the .oecd_source DB fallback, and the
  auto-fetch status banner. OECD now resolves only from uploaded files, and the
  file tag renders grey-link / green-when-uploaded like A01, X09, etc.
- Remove the "reference periods vary / comparisons should be treated with
  caution" disclaimer (and its superscript marker) from both the in-app OECD
  preview and the Word briefing template; the source citation, UK ONS note and
  the age-basis note are kept.

Co-Authored-By: Claude Opus 4.8 <noreply@anthropic.com>
Claude-Session: https://claude.ai/code/session_01RaVwxZAftTopCxJuhiAfzF
</commit_message>
<xml_diff>
--- a/labour-market-stats-brief-main-2/utils/ManualDB.docx
+++ b/labour-market-stats-brief-main-2/utils/ManualDB.docx
@@ -5098,7 +5098,7 @@
                 <w:szCs w:val="24"/>
                 <w:vertAlign w:val="superscript"/>
               </w:rPr>
-              <w:t>1</w:t>
+              <w:t/>
             </w:r>
           </w:p>
         </w:tc>
@@ -6888,7 +6888,7 @@
           <w:szCs w:val="28"/>
           <w:vertAlign w:val="superscript"/>
         </w:rPr>
-        <w:t>1</w:t>
+        <w:t/>
       </w:r>
       <w:r>
         <w:rPr>
@@ -6896,7 +6896,7 @@
           <w:sz w:val="22"/>
           <w:szCs w:val="28"/>
         </w:rPr>
-        <w:t xml:space="preserve">Note: </w:t>
+        <w:t xml:space="preserve"/>
       </w:r>
       <w:r>
         <w:rPr>
@@ -6904,7 +6904,7 @@
           <w:sz w:val="22"/>
           <w:szCs w:val="28"/>
         </w:rPr>
-        <w:t>Included is the latest OECD data. C</w:t>
+        <w:t/>
       </w:r>
       <w:r>
         <w:rPr>
@@ -6912,7 +6912,7 @@
           <w:sz w:val="22"/>
           <w:szCs w:val="28"/>
         </w:rPr>
-        <w:t>ountries release labour market statistics on</w:t>
+        <w:t/>
       </w:r>
       <w:r>
         <w:rPr>
@@ -6920,7 +6920,7 @@
           <w:sz w:val="22"/>
           <w:szCs w:val="28"/>
         </w:rPr>
-        <w:t xml:space="preserve"> different </w:t>
+        <w:t xml:space="preserve"/>
       </w:r>
       <w:r>
         <w:rPr>
@@ -6928,7 +6928,7 @@
           <w:sz w:val="22"/>
           <w:szCs w:val="28"/>
         </w:rPr>
-        <w:t>schedules</w:t>
+        <w:t/>
       </w:r>
       <w:r>
         <w:rPr>
@@ -6936,7 +6936,7 @@
           <w:sz w:val="22"/>
           <w:szCs w:val="28"/>
         </w:rPr>
-        <w:t xml:space="preserve"> and</w:t>
+        <w:t xml:space="preserve"/>
       </w:r>
       <w:r>
         <w:rPr>
@@ -6944,7 +6944,7 @@
           <w:sz w:val="22"/>
           <w:szCs w:val="28"/>
         </w:rPr>
-        <w:t xml:space="preserve"> </w:t>
+        <w:t xml:space="preserve"/>
       </w:r>
       <w:r>
         <w:rPr>
@@ -6952,7 +6952,7 @@
           <w:sz w:val="22"/>
           <w:szCs w:val="28"/>
         </w:rPr>
-        <w:t xml:space="preserve">so </w:t>
+        <w:t xml:space="preserve"/>
       </w:r>
       <w:r>
         <w:rPr>
@@ -6960,7 +6960,7 @@
           <w:sz w:val="22"/>
           <w:szCs w:val="28"/>
         </w:rPr>
-        <w:t>r</w:t>
+        <w:t/>
       </w:r>
       <w:r>
         <w:rPr>
@@ -6968,7 +6968,7 @@
           <w:sz w:val="22"/>
           <w:szCs w:val="28"/>
         </w:rPr>
-        <w:t>eference</w:t>
+        <w:t/>
       </w:r>
       <w:r>
         <w:rPr>
@@ -6976,7 +6976,7 @@
           <w:sz w:val="22"/>
           <w:szCs w:val="28"/>
         </w:rPr>
-        <w:t xml:space="preserve"> periods </w:t>
+        <w:t xml:space="preserve"/>
       </w:r>
       <w:r>
         <w:rPr>
@@ -6984,7 +6984,7 @@
           <w:sz w:val="22"/>
           <w:szCs w:val="28"/>
         </w:rPr>
-        <w:t>vary</w:t>
+        <w:t/>
       </w:r>
       <w:r>
         <w:rPr>
@@ -6992,7 +6992,7 @@
           <w:sz w:val="22"/>
           <w:szCs w:val="28"/>
         </w:rPr>
-        <w:t>,</w:t>
+        <w:t/>
       </w:r>
       <w:r>
         <w:rPr>
@@ -7000,7 +7000,7 @@
           <w:sz w:val="22"/>
           <w:szCs w:val="28"/>
         </w:rPr>
-        <w:t xml:space="preserve"> </w:t>
+        <w:t xml:space="preserve"/>
       </w:r>
       <w:r>
         <w:rPr>
@@ -7008,7 +7008,7 @@
           <w:sz w:val="22"/>
           <w:szCs w:val="28"/>
         </w:rPr>
-        <w:t>with</w:t>
+        <w:t/>
       </w:r>
       <w:r>
         <w:rPr>
@@ -7016,7 +7016,7 @@
           <w:sz w:val="22"/>
           <w:szCs w:val="28"/>
         </w:rPr>
-        <w:t xml:space="preserve"> </w:t>
+        <w:t xml:space="preserve"/>
       </w:r>
       <w:r>
         <w:rPr>
@@ -7024,7 +7024,7 @@
           <w:sz w:val="22"/>
           <w:szCs w:val="28"/>
         </w:rPr>
-        <w:t>some outdated</w:t>
+        <w:t/>
       </w:r>
       <w:r>
         <w:rPr>
@@ -7032,7 +7032,7 @@
           <w:sz w:val="22"/>
           <w:szCs w:val="28"/>
         </w:rPr>
-        <w:t>. Co</w:t>
+        <w:t/>
       </w:r>
       <w:r>
         <w:rPr>
@@ -7040,7 +7040,7 @@
           <w:sz w:val="22"/>
           <w:szCs w:val="28"/>
         </w:rPr>
-        <w:t>mparisons</w:t>
+        <w:t/>
       </w:r>
       <w:r>
         <w:rPr>
@@ -7048,7 +7048,7 @@
           <w:sz w:val="22"/>
           <w:szCs w:val="28"/>
         </w:rPr>
-        <w:t xml:space="preserve"> should be </w:t>
+        <w:t xml:space="preserve"/>
       </w:r>
       <w:r>
         <w:rPr>
@@ -7056,7 +7056,7 @@
           <w:sz w:val="22"/>
           <w:szCs w:val="28"/>
         </w:rPr>
-        <w:t>treated</w:t>
+        <w:t/>
       </w:r>
       <w:r>
         <w:rPr>
@@ -7064,7 +7064,7 @@
           <w:sz w:val="22"/>
           <w:szCs w:val="28"/>
         </w:rPr>
-        <w:t xml:space="preserve"> with caution.</w:t>
+        <w:t xml:space="preserve"/>
       </w:r>
     </w:p>
     <w:p>

</xml_diff>

<commit_message>
Restore OECD footnote disclaimer (kept the auto-fetch banner removal)
Misread the earlier request: the text to remove was the "upload CSVs to
override" auto-fetch status banner (already gone with the manual-OECD change),
not the table footnote. Put the "reference periods vary / comparisons should be
treated with caution" note and its superscript marker back in the in-app OECD
preview and the Word template.

Co-Authored-By: Claude Opus 4.8 <noreply@anthropic.com>
Claude-Session: https://claude.ai/code/session_01RaVwxZAftTopCxJuhiAfzF
</commit_message>
<xml_diff>
--- a/labour-market-stats-brief-main-2/utils/ManualDB.docx
+++ b/labour-market-stats-brief-main-2/utils/ManualDB.docx
@@ -5098,7 +5098,7 @@
                 <w:szCs w:val="24"/>
                 <w:vertAlign w:val="superscript"/>
               </w:rPr>
-              <w:t/>
+              <w:t>1</w:t>
             </w:r>
           </w:p>
         </w:tc>
@@ -6888,7 +6888,7 @@
           <w:szCs w:val="28"/>
           <w:vertAlign w:val="superscript"/>
         </w:rPr>
-        <w:t/>
+        <w:t>1</w:t>
       </w:r>
       <w:r>
         <w:rPr>
@@ -6896,7 +6896,7 @@
           <w:sz w:val="22"/>
           <w:szCs w:val="28"/>
         </w:rPr>
-        <w:t xml:space="preserve"/>
+        <w:t xml:space="preserve">Note: </w:t>
       </w:r>
       <w:r>
         <w:rPr>
@@ -6904,7 +6904,7 @@
           <w:sz w:val="22"/>
           <w:szCs w:val="28"/>
         </w:rPr>
-        <w:t/>
+        <w:t>Included is the latest OECD data. C</w:t>
       </w:r>
       <w:r>
         <w:rPr>
@@ -6912,7 +6912,7 @@
           <w:sz w:val="22"/>
           <w:szCs w:val="28"/>
         </w:rPr>
-        <w:t/>
+        <w:t>ountries release labour market statistics on</w:t>
       </w:r>
       <w:r>
         <w:rPr>
@@ -6920,7 +6920,7 @@
           <w:sz w:val="22"/>
           <w:szCs w:val="28"/>
         </w:rPr>
-        <w:t xml:space="preserve"/>
+        <w:t xml:space="preserve"> different </w:t>
       </w:r>
       <w:r>
         <w:rPr>
@@ -6928,7 +6928,7 @@
           <w:sz w:val="22"/>
           <w:szCs w:val="28"/>
         </w:rPr>
-        <w:t/>
+        <w:t>schedules</w:t>
       </w:r>
       <w:r>
         <w:rPr>
@@ -6936,7 +6936,7 @@
           <w:sz w:val="22"/>
           <w:szCs w:val="28"/>
         </w:rPr>
-        <w:t xml:space="preserve"/>
+        <w:t xml:space="preserve"> and</w:t>
       </w:r>
       <w:r>
         <w:rPr>
@@ -6944,7 +6944,7 @@
           <w:sz w:val="22"/>
           <w:szCs w:val="28"/>
         </w:rPr>
-        <w:t xml:space="preserve"/>
+        <w:t xml:space="preserve"> </w:t>
       </w:r>
       <w:r>
         <w:rPr>
@@ -6952,7 +6952,7 @@
           <w:sz w:val="22"/>
           <w:szCs w:val="28"/>
         </w:rPr>
-        <w:t xml:space="preserve"/>
+        <w:t xml:space="preserve">so </w:t>
       </w:r>
       <w:r>
         <w:rPr>
@@ -6960,7 +6960,7 @@
           <w:sz w:val="22"/>
           <w:szCs w:val="28"/>
         </w:rPr>
-        <w:t/>
+        <w:t>r</w:t>
       </w:r>
       <w:r>
         <w:rPr>
@@ -6968,7 +6968,7 @@
           <w:sz w:val="22"/>
           <w:szCs w:val="28"/>
         </w:rPr>
-        <w:t/>
+        <w:t>eference</w:t>
       </w:r>
       <w:r>
         <w:rPr>
@@ -6976,7 +6976,7 @@
           <w:sz w:val="22"/>
           <w:szCs w:val="28"/>
         </w:rPr>
-        <w:t xml:space="preserve"/>
+        <w:t xml:space="preserve"> periods </w:t>
       </w:r>
       <w:r>
         <w:rPr>
@@ -6984,7 +6984,7 @@
           <w:sz w:val="22"/>
           <w:szCs w:val="28"/>
         </w:rPr>
-        <w:t/>
+        <w:t>vary</w:t>
       </w:r>
       <w:r>
         <w:rPr>
@@ -6992,7 +6992,7 @@
           <w:sz w:val="22"/>
           <w:szCs w:val="28"/>
         </w:rPr>
-        <w:t/>
+        <w:t>,</w:t>
       </w:r>
       <w:r>
         <w:rPr>
@@ -7000,7 +7000,7 @@
           <w:sz w:val="22"/>
           <w:szCs w:val="28"/>
         </w:rPr>
-        <w:t xml:space="preserve"/>
+        <w:t xml:space="preserve"> </w:t>
       </w:r>
       <w:r>
         <w:rPr>
@@ -7008,7 +7008,7 @@
           <w:sz w:val="22"/>
           <w:szCs w:val="28"/>
         </w:rPr>
-        <w:t/>
+        <w:t>with</w:t>
       </w:r>
       <w:r>
         <w:rPr>
@@ -7016,7 +7016,7 @@
           <w:sz w:val="22"/>
           <w:szCs w:val="28"/>
         </w:rPr>
-        <w:t xml:space="preserve"/>
+        <w:t xml:space="preserve"> </w:t>
       </w:r>
       <w:r>
         <w:rPr>
@@ -7024,7 +7024,7 @@
           <w:sz w:val="22"/>
           <w:szCs w:val="28"/>
         </w:rPr>
-        <w:t/>
+        <w:t>some outdated</w:t>
       </w:r>
       <w:r>
         <w:rPr>
@@ -7032,7 +7032,7 @@
           <w:sz w:val="22"/>
           <w:szCs w:val="28"/>
         </w:rPr>
-        <w:t/>
+        <w:t>. Co</w:t>
       </w:r>
       <w:r>
         <w:rPr>
@@ -7040,7 +7040,7 @@
           <w:sz w:val="22"/>
           <w:szCs w:val="28"/>
         </w:rPr>
-        <w:t/>
+        <w:t>mparisons</w:t>
       </w:r>
       <w:r>
         <w:rPr>
@@ -7048,7 +7048,7 @@
           <w:sz w:val="22"/>
           <w:szCs w:val="28"/>
         </w:rPr>
-        <w:t xml:space="preserve"/>
+        <w:t xml:space="preserve"> should be </w:t>
       </w:r>
       <w:r>
         <w:rPr>
@@ -7056,7 +7056,7 @@
           <w:sz w:val="22"/>
           <w:szCs w:val="28"/>
         </w:rPr>
-        <w:t/>
+        <w:t>treated</w:t>
       </w:r>
       <w:r>
         <w:rPr>
@@ -7064,7 +7064,7 @@
           <w:sz w:val="22"/>
           <w:szCs w:val="28"/>
         </w:rPr>
-        <w:t xml:space="preserve"/>
+        <w:t xml:space="preserve"> with caution.</w:t>
       </w:r>
     </w:p>
     <w:p>

</xml_diff>